<commit_message>
docs: update physicians guide for 0.6.0 (proportions calibration, ANCOVA v3 result)
- Bump version references 0.5.1 -> 0.6.0.
- Section 4: add the fisher_exact two-band (Fragile / Not fragile, L=58)
  calibration as a second validated setting alongside Welch, with its
  eligibility profile; narrow the fail-closed list accordingly.
- Section 6: report that the ANCOVA violation-detection re-aim (Track E)
  concluded not confirmed, making three documented negative findings;
  note the replication-probability re-aim is still unattempted.
- Glossary: add Fisher's exact test entry.

Co-Authored-By: Claude Sonnet 5 <noreply@anthropic.com>
</commit_message>
<xml_diff>
--- a/manuscript/stabilitest-physicians-guide.docx
+++ b/manuscript/stabilitest-physicians-guide.docx
@@ -45,7 +45,7 @@
           <w:sz w:val="20"/>
           <w:szCs w:val="20"/>
         </w:rPr>
-        <w:t xml:space="preserve">Plain-language companion to stabilitest v0.5.1 - August 2026</w:t>
+        <w:t xml:space="preserve">Plain-language companion to stabilitest v0.6.0 - August 2026</w:t>
       </w:r>
     </w:p>
     <w:p>
@@ -687,19 +687,31 @@
       </w:pPr>
       <w:r>
         <w:rPr>
+          <w:sz w:val="22"/>
+          <w:szCs w:val="22"/>
+        </w:rPr>
+        <w:t xml:space="preserve">A second setting has since been validated too: comparing two groups on a yes/no outcome - responder versus non-responder, say - with Fisher's exact test. Because one yes/no comparison carries less information than a continuous measurement, this validation supports only two tiers, not three: a score of 58 or below is Fragile, above 58 is Not fragile - there is no Robust tier here. The range applies only within the profile it was validated on (roughly 25-200 patients per arm, arms of similar size, and a control-arm event rate between 8% and 55% with at least three events and three non-events) and only under the specific weighting the calibration study used. Outside that profile, or under the package's default weighting, a binary-outcome trial still gets the full numeric breakdown - just no printed verdict.</w:t>
+      </w:r>
+    </w:p>
+    <w:p>
+      <w:pPr>
+        <w:spacing w:after="160" w:line="276"/>
+      </w:pPr>
+      <w:r>
+        <w:rPr>
           <w:b/>
           <w:bCs/>
           <w:sz w:val="22"/>
           <w:szCs w:val="22"/>
         </w:rPr>
-        <w:t xml:space="preserve">Crucially, these ranges were validated only for that specific analysis. </w:t>
-      </w:r>
-      <w:r>
-        <w:rPr>
-          <w:sz w:val="22"/>
-          <w:szCs w:val="22"/>
-        </w:rPr>
-        <w:t xml:space="preserve">For every other analysis - adjusted comparisons, survival analyses, binary outcomes, equivalence testing - stabilitest reports all the numbers but shows no verdict label. Like a responsible laboratory, it will not print a reference range it has not validated for your assay. The designers call this “fail-closed”: when validation is missing or fails, the label stays silent.</w:t>
+        <w:t xml:space="preserve">Crucially, these ranges were validated only for those two specific analyses. </w:t>
+      </w:r>
+      <w:r>
+        <w:rPr>
+          <w:sz w:val="22"/>
+          <w:szCs w:val="22"/>
+        </w:rPr>
+        <w:t xml:space="preserve">For every other analysis - adjusted comparisons, survival analyses, binary-outcome trials outside the validated profile above, equivalence testing - stabilitest reports all the numbers but shows no verdict label. Like a responsible laboratory, it will not print a reference range it has not validated for your assay. The designers call this “fail-closed”: when validation is missing or fails, the label stays silent.</w:t>
       </w:r>
     </w:p>
     <w:p>
@@ -893,7 +905,7 @@
           <w:sz w:val="22"/>
           <w:szCs w:val="22"/>
         </w:rPr>
-        <w:t xml:space="preserve">Work now under way re-aims the validation at a target with direct clinical meaning: instead of three verdict zones, calibrating the score as an estimated probability that an identical repeat trial would again be significant, and testing whether the score can detect violated analysis assumptions - the one job a p-value genuinely cannot do.</w:t>
+        <w:t xml:space="preserve">A re-aim was then tried at a target with more direct clinical meaning: instead of a three-zone verdict, could the score detect adjusted analyses whose assumptions had been quietly violated - the one job a p-value genuinely cannot do? A pre-registered study tested exactly this, and again the answer was no: the added detective power over the p-value alone was statistically indistinguishable from zero. That makes three rigorously documented negative findings for the adjusted-analysis setting, each published with the same rigor a positive result would have received, and none used to loosen the original passing criteria. A further re-aim - calibrating the score as an estimated probability that a repeat trial would again be significant, rather than as a Robust/Fragile verdict - is a considered next step that has not yet been attempted.</w:t>
       </w:r>
     </w:p>
     <w:p>
@@ -1576,6 +1588,58 @@
                 <w:sz w:val="20"/>
                 <w:szCs w:val="20"/>
               </w:rPr>
+              <w:t xml:space="preserve">Fisher's exact test</w:t>
+            </w:r>
+          </w:p>
+        </w:tc>
+        <w:tc>
+          <w:tcPr>
+            <w:tcW w:type="dxa" w:w="6526"/>
+            <w:tcMar>
+              <w:top w:type="dxa" w:w="80"/>
+              <w:left w:type="dxa" w:w="120"/>
+              <w:bottom w:type="dxa" w:w="80"/>
+              <w:right w:type="dxa" w:w="120"/>
+            </w:tcMar>
+          </w:tcPr>
+          <w:p>
+            <w:pPr>
+              <w:jc w:val="left"/>
+            </w:pPr>
+            <w:r>
+              <w:rPr>
+                <w:b w:val="false"/>
+                <w:bCs w:val="false"/>
+                <w:sz w:val="20"/>
+                <w:szCs w:val="20"/>
+              </w:rPr>
+              <w:t xml:space="preserve">A test comparing two groups on a yes/no outcome. The second setting with a validated verdict - Fragile or Not fragile - within its calibrated profile (Section 4).</w:t>
+            </w:r>
+          </w:p>
+        </w:tc>
+      </w:tr>
+      <w:tr>
+        <w:tc>
+          <w:tcPr>
+            <w:tcW w:type="dxa" w:w="2500"/>
+            <w:tcMar>
+              <w:top w:type="dxa" w:w="80"/>
+              <w:left w:type="dxa" w:w="120"/>
+              <w:bottom w:type="dxa" w:w="80"/>
+              <w:right w:type="dxa" w:w="120"/>
+            </w:tcMar>
+          </w:tcPr>
+          <w:p>
+            <w:pPr>
+              <w:jc w:val="left"/>
+            </w:pPr>
+            <w:r>
+              <w:rPr>
+                <w:b/>
+                <w:bCs/>
+                <w:sz w:val="20"/>
+                <w:szCs w:val="20"/>
+              </w:rPr>
               <w:t xml:space="preserve">Fail-closed</w:t>
             </w:r>
           </w:p>
@@ -1738,7 +1802,7 @@
           <w:sz w:val="18"/>
           <w:szCs w:val="18"/>
         </w:rPr>
-        <w:t xml:space="preserve">Prepared as a plain-language companion to the stabilitest R package, version 0.5.1 (August 2026). The technical manuscript, simulation code, and pre-registered calibration materials are available in the package repository.</w:t>
+        <w:t xml:space="preserve">Prepared as a plain-language companion to the stabilitest R package, version 0.6.0 (August 2026). The technical manuscript, simulation code, and pre-registered calibration materials are available in the package repository.</w:t>
       </w:r>
     </w:p>
     <w:sectPr>

</xml_diff>